<commit_message>
feat: nối form đăng ký với Google Sheet qua Apps Script
Form đăng ký trước đây chỉ giả lập gửi thành công, dữ liệu khách nhập
bị mất hoàn toàn (không lưu, không gửi đi đâu). Giờ submitForm() gửi
tên/SĐT/tỉnh/tình trạng giày qua fetch() tới Web App endpoint
(FORM_ENDPOINT) để ghi vào Google Sheet "Đăng Ký Đổi Giày - Lotto
2026". Kèm code Apps Script (apps-script-form-dang-ky.gs) và hướng
dẫn deploy trong HUONG_DAN_TEAM (Phần 1C). Đã test end-to-end thành
công qua endpoint thật.

Co-Authored-By: Claude Sonnet 5 <noreply@anthropic.com>
</commit_message>
<xml_diff>
--- a/HUONG_DAN_TEAM.docx
+++ b/HUONG_DAN_TEAM.docx
@@ -10,7 +10,7 @@
         <w:t xml:space="preserve">Hướng dẫn quản trị Landing Page - Thu Cũ Đổi Mới Lotto 2026</w:t>
       </w:r>
     </w:p>
-    <w:bookmarkStart w:id="28" w:name="Xe39aa62b98614b88b96024c7b8252c135a1e4a9"/>
+    <w:bookmarkStart w:id="33" w:name="Xe39aa62b98614b88b96024c7b8252c135a1e4a9"/>
     <w:p>
       <w:pPr>
         <w:pStyle w:val="Heading1"/>
@@ -2156,7 +2156,7 @@
         <w:rPr>
           <w:rStyle w:val="VerbatimChar"/>
         </w:rPr>
-        <w:t xml:space="preserve">LandingPage_ThuCuDoiMoi_Lotto2026.html</w:t>
+        <w:t xml:space="preserve">index.html</w:t>
       </w:r>
       <w:r>
         <w:t xml:space="preserve">, tìm dòng:</w:t>
@@ -2263,22 +2263,95 @@
     </w:p>
     <w:bookmarkEnd w:id="18"/>
     <w:bookmarkEnd w:id="19"/>
-    <w:bookmarkStart w:id="25" w:name="phần-2-team-mkt-cập-nhật-hàng-ngày"/>
+    <w:bookmarkStart w:id="24" w:name="Xc51b2a3a2c0f5866c03c8716e38dff626b3c6c4"/>
     <w:p>
       <w:pPr>
         <w:pStyle w:val="Heading2"/>
       </w:pPr>
       <w:r>
-        <w:t xml:space="preserve">PHẦN 2 — Team MKT cập nhật hàng ngày</w:t>
-      </w:r>
-    </w:p>
-    <w:bookmarkStart w:id="20" w:name="thêm-đại-lý-mới"/>
+        <w:t xml:space="preserve">PHẦN 1C — Nhận dữ liệu form đăng ký (Admin thực hiện 1 lần)</w:t>
+      </w:r>
+    </w:p>
+    <w:p>
+      <w:pPr>
+        <w:pStyle w:val="FirstParagraph"/>
+      </w:pPr>
+      <w:r>
+        <w:t xml:space="preserve">Mặc định form đăng ký ở cuối trang</w:t>
+      </w:r>
+      <w:r>
+        <w:t xml:space="preserve"> </w:t>
+      </w:r>
+      <w:r>
+        <w:rPr>
+          <w:b/>
+          <w:bCs/>
+        </w:rPr>
+        <w:t xml:space="preserve">không lưu dữ liệu đi đâu cả</w:t>
+      </w:r>
+      <w:r>
+        <w:t xml:space="preserve"> </w:t>
+      </w:r>
+      <w:r>
+        <w:t xml:space="preserve">— cần nối vào</w:t>
+      </w:r>
+      <w:r>
+        <w:t xml:space="preserve"> </w:t>
+      </w:r>
+      <w:r>
+        <w:t xml:space="preserve">Google Sheet qua Google Apps Script (miễn phí, không cần server riêng).</w:t>
+      </w:r>
+    </w:p>
+    <w:bookmarkStart w:id="20" w:name="bước-1-đã-có-sẵn-sheet-nhận-dữ-liệu"/>
     <w:p>
       <w:pPr>
         <w:pStyle w:val="Heading3"/>
       </w:pPr>
       <w:r>
-        <w:t xml:space="preserve">Thêm đại lý mới</w:t>
+        <w:t xml:space="preserve">Bước 1: Đã có sẵn Sheet nhận dữ liệu</w:t>
+      </w:r>
+    </w:p>
+    <w:p>
+      <w:pPr>
+        <w:pStyle w:val="FirstParagraph"/>
+      </w:pPr>
+      <w:r>
+        <w:t xml:space="preserve">Sheet</w:t>
+      </w:r>
+      <w:r>
+        <w:t xml:space="preserve"> </w:t>
+      </w:r>
+      <w:r>
+        <w:rPr>
+          <w:b/>
+          <w:bCs/>
+        </w:rPr>
+        <w:t xml:space="preserve">“Đăng Ký Đổi Giày - Lotto 2026”</w:t>
+      </w:r>
+      <w:r>
+        <w:t xml:space="preserve"> </w:t>
+      </w:r>
+      <w:r>
+        <w:t xml:space="preserve">đã được tạo sẵn với các cột:</w:t>
+      </w:r>
+      <w:r>
+        <w:t xml:space="preserve"> </w:t>
+      </w:r>
+      <w:r>
+        <w:rPr>
+          <w:rStyle w:val="VerbatimChar"/>
+        </w:rPr>
+        <w:t xml:space="preserve">thoi_gian | ho_ten | so_dien_thoai | tinh_thanh | tinh_trang_giay</w:t>
+      </w:r>
+    </w:p>
+    <w:bookmarkEnd w:id="20"/>
+    <w:bookmarkStart w:id="21" w:name="bước-2-gắn-apps-script-vào-sheet"/>
+    <w:p>
+      <w:pPr>
+        <w:pStyle w:val="Heading3"/>
+      </w:pPr>
+      <w:r>
+        <w:t xml:space="preserve">Bước 2: Gắn Apps Script vào Sheet</w:t>
       </w:r>
     </w:p>
     <w:p>
@@ -2290,7 +2363,33 @@
         </w:numPr>
       </w:pPr>
       <w:r>
-        <w:t xml:space="preserve">Mở Google Sheet (đã có link sẵn)</w:t>
+        <w:t xml:space="preserve">Mở Sheet →</w:t>
+      </w:r>
+      <w:r>
+        <w:t xml:space="preserve"> </w:t>
+      </w:r>
+      <w:r>
+        <w:rPr>
+          <w:b/>
+          <w:bCs/>
+        </w:rPr>
+        <w:t xml:space="preserve">Extensions (Tiện ích mở rộng)</w:t>
+      </w:r>
+      <w:r>
+        <w:t xml:space="preserve"> </w:t>
+      </w:r>
+      <w:r>
+        <w:t xml:space="preserve">→</w:t>
+      </w:r>
+      <w:r>
+        <w:t xml:space="preserve"> </w:t>
+      </w:r>
+      <w:r>
+        <w:rPr>
+          <w:b/>
+          <w:bCs/>
+        </w:rPr>
+        <w:t xml:space="preserve">Apps Script</w:t>
       </w:r>
     </w:p>
     <w:p>
@@ -2302,7 +2401,22 @@
         </w:numPr>
       </w:pPr>
       <w:r>
-        <w:t xml:space="preserve">Thêm 1 dòng mới với đầy đủ các cột</w:t>
+        <w:t xml:space="preserve">Xóa hết code mẫu, dán toàn bộ nội dung file</w:t>
+      </w:r>
+      <w:r>
+        <w:t xml:space="preserve"> </w:t>
+      </w:r>
+      <w:r>
+        <w:rPr>
+          <w:rStyle w:val="VerbatimChar"/>
+        </w:rPr>
+        <w:t xml:space="preserve">apps-script-form-dang-ky.gs</w:t>
+      </w:r>
+      <w:r>
+        <w:t xml:space="preserve"> </w:t>
+      </w:r>
+      <w:r>
+        <w:t xml:space="preserve">(nằm cùng thư mục dự án) vào</w:t>
       </w:r>
     </w:p>
     <w:p>
@@ -2314,27 +2428,33 @@
         </w:numPr>
       </w:pPr>
       <w:r>
+        <w:t xml:space="preserve">Bấm</w:t>
+      </w:r>
+      <w:r>
+        <w:t xml:space="preserve"> </w:t>
+      </w:r>
+      <w:r>
         <w:rPr>
           <w:b/>
           <w:bCs/>
         </w:rPr>
-        <w:t xml:space="preserve">Lưu là xong</w:t>
-      </w:r>
-      <w:r>
-        <w:t xml:space="preserve"> </w:t>
-      </w:r>
-      <w:r>
-        <w:t xml:space="preserve">— trang tự cập nhật khi người dùng load lại</w:t>
-      </w:r>
-    </w:p>
-    <w:bookmarkEnd w:id="20"/>
-    <w:bookmarkStart w:id="21" w:name="xóa-đại-lý"/>
+        <w:t xml:space="preserve">Save</w:t>
+      </w:r>
+      <w:r>
+        <w:t xml:space="preserve"> </w:t>
+      </w:r>
+      <w:r>
+        <w:t xml:space="preserve">(biểu tượng đĩa mềm)</w:t>
+      </w:r>
+    </w:p>
+    <w:bookmarkEnd w:id="21"/>
+    <w:bookmarkStart w:id="22" w:name="bước-3-deploy-thành-web-app"/>
     <w:p>
       <w:pPr>
         <w:pStyle w:val="Heading3"/>
       </w:pPr>
       <w:r>
-        <w:t xml:space="preserve">Xóa đại lý</w:t>
+        <w:t xml:space="preserve">Bước 3: Deploy thành Web App</w:t>
       </w:r>
     </w:p>
     <w:p>
@@ -2346,7 +2466,33 @@
         </w:numPr>
       </w:pPr>
       <w:r>
-        <w:t xml:space="preserve">Mở Google Sheet</w:t>
+        <w:t xml:space="preserve">Góc trên phải →</w:t>
+      </w:r>
+      <w:r>
+        <w:t xml:space="preserve"> </w:t>
+      </w:r>
+      <w:r>
+        <w:rPr>
+          <w:b/>
+          <w:bCs/>
+        </w:rPr>
+        <w:t xml:space="preserve">Deploy</w:t>
+      </w:r>
+      <w:r>
+        <w:t xml:space="preserve"> </w:t>
+      </w:r>
+      <w:r>
+        <w:t xml:space="preserve">→</w:t>
+      </w:r>
+      <w:r>
+        <w:t xml:space="preserve"> </w:t>
+      </w:r>
+      <w:r>
+        <w:rPr>
+          <w:b/>
+          <w:bCs/>
+        </w:rPr>
+        <w:t xml:space="preserve">New deployment</w:t>
       </w:r>
     </w:p>
     <w:p>
@@ -2358,7 +2504,29 @@
         </w:numPr>
       </w:pPr>
       <w:r>
-        <w:t xml:space="preserve">Xóa dòng của đại lý cần xóa</w:t>
+        <w:t xml:space="preserve">Bấm biểu tượng ⚙️ cạnh</w:t>
+      </w:r>
+      <w:r>
+        <w:t xml:space="preserve"> </w:t>
+      </w:r>
+      <w:r>
+        <w:t xml:space="preserve">“Select type”</w:t>
+      </w:r>
+      <w:r>
+        <w:t xml:space="preserve"> </w:t>
+      </w:r>
+      <w:r>
+        <w:t xml:space="preserve">→ chọn</w:t>
+      </w:r>
+      <w:r>
+        <w:t xml:space="preserve"> </w:t>
+      </w:r>
+      <w:r>
+        <w:rPr>
+          <w:b/>
+          <w:bCs/>
+        </w:rPr>
+        <w:t xml:space="preserve">Web app</w:t>
       </w:r>
     </w:p>
     <w:p>
@@ -2370,17 +2538,45 @@
         </w:numPr>
       </w:pPr>
       <w:r>
-        <w:t xml:space="preserve">Lưu là xong</w:t>
-      </w:r>
-    </w:p>
-    <w:bookmarkEnd w:id="21"/>
-    <w:bookmarkStart w:id="22" w:name="sửa-thông-tin-đại-lý-địa-chỉ-tên"/>
-    <w:p>
-      <w:pPr>
-        <w:pStyle w:val="Heading3"/>
-      </w:pPr>
-      <w:r>
-        <w:t xml:space="preserve">Sửa thông tin đại lý (địa chỉ, tên…)</w:t>
+        <w:t xml:space="preserve">Cấu hình:</w:t>
+      </w:r>
+    </w:p>
+    <w:p>
+      <w:pPr>
+        <w:pStyle w:val="Compact"/>
+        <w:numPr>
+          <w:ilvl w:val="1"/>
+          <w:numId w:val="1010"/>
+        </w:numPr>
+      </w:pPr>
+      <w:r>
+        <w:rPr>
+          <w:b/>
+          <w:bCs/>
+        </w:rPr>
+        <w:t xml:space="preserve">Execute as</w:t>
+      </w:r>
+      <w:r>
+        <w:t xml:space="preserve">: Me (tài khoản của bạn)</w:t>
+      </w:r>
+    </w:p>
+    <w:p>
+      <w:pPr>
+        <w:pStyle w:val="Compact"/>
+        <w:numPr>
+          <w:ilvl w:val="1"/>
+          <w:numId w:val="1010"/>
+        </w:numPr>
+      </w:pPr>
+      <w:r>
+        <w:rPr>
+          <w:b/>
+          <w:bCs/>
+        </w:rPr>
+        <w:t xml:space="preserve">Who has access</w:t>
+      </w:r>
+      <w:r>
+        <w:t xml:space="preserve">: Anyone</w:t>
       </w:r>
     </w:p>
     <w:p>
@@ -2388,11 +2584,109 @@
         <w:pStyle w:val="Compact"/>
         <w:numPr>
           <w:ilvl w:val="0"/>
-          <w:numId w:val="1010"/>
+          <w:numId w:val="1009"/>
         </w:numPr>
       </w:pPr>
       <w:r>
-        <w:t xml:space="preserve">Mở Google Sheet</w:t>
+        <w:t xml:space="preserve">Bấm</w:t>
+      </w:r>
+      <w:r>
+        <w:t xml:space="preserve"> </w:t>
+      </w:r>
+      <w:r>
+        <w:rPr>
+          <w:b/>
+          <w:bCs/>
+        </w:rPr>
+        <w:t xml:space="preserve">Deploy</w:t>
+      </w:r>
+      <w:r>
+        <w:t xml:space="preserve"> </w:t>
+      </w:r>
+      <w:r>
+        <w:t xml:space="preserve">→ lần đầu sẽ yêu cầu</w:t>
+      </w:r>
+      <w:r>
+        <w:t xml:space="preserve"> </w:t>
+      </w:r>
+      <w:r>
+        <w:rPr>
+          <w:b/>
+          <w:bCs/>
+        </w:rPr>
+        <w:t xml:space="preserve">Authorize access</w:t>
+      </w:r>
+      <w:r>
+        <w:t xml:space="preserve"> </w:t>
+      </w:r>
+      <w:r>
+        <w:t xml:space="preserve">→ chọn tài khoản Google →</w:t>
+      </w:r>
+      <w:r>
+        <w:t xml:space="preserve"> </w:t>
+      </w:r>
+      <w:r>
+        <w:t xml:space="preserve">bấm</w:t>
+      </w:r>
+      <w:r>
+        <w:t xml:space="preserve"> </w:t>
+      </w:r>
+      <w:r>
+        <w:rPr>
+          <w:b/>
+          <w:bCs/>
+        </w:rPr>
+        <w:t xml:space="preserve">Advanced</w:t>
+      </w:r>
+      <w:r>
+        <w:t xml:space="preserve"> </w:t>
+      </w:r>
+      <w:r>
+        <w:t xml:space="preserve">→</w:t>
+      </w:r>
+      <w:r>
+        <w:t xml:space="preserve"> </w:t>
+      </w:r>
+      <w:r>
+        <w:rPr>
+          <w:b/>
+          <w:bCs/>
+        </w:rPr>
+        <w:t xml:space="preserve">Go to (tên project) (unsafe)</w:t>
+      </w:r>
+      <w:r>
+        <w:t xml:space="preserve"> </w:t>
+      </w:r>
+      <w:r>
+        <w:t xml:space="preserve">→</w:t>
+      </w:r>
+      <w:r>
+        <w:t xml:space="preserve"> </w:t>
+      </w:r>
+      <w:r>
+        <w:rPr>
+          <w:b/>
+          <w:bCs/>
+        </w:rPr>
+        <w:t xml:space="preserve">Allow</w:t>
+      </w:r>
+      <w:r>
+        <w:t xml:space="preserve"> </w:t>
+      </w:r>
+      <w:r>
+        <w:t xml:space="preserve">(Cảnh báo</w:t>
+      </w:r>
+      <w:r>
+        <w:t xml:space="preserve"> </w:t>
+      </w:r>
+      <w:r>
+        <w:t xml:space="preserve">“unsafe”</w:t>
+      </w:r>
+      <w:r>
+        <w:t xml:space="preserve"> </w:t>
+      </w:r>
+      <w:r>
+        <w:t xml:space="preserve">là bình thường vì đây là script tự viết, chưa qua Google verify)</w:t>
       </w:r>
     </w:p>
     <w:p>
@@ -2400,33 +2694,215 @@
         <w:pStyle w:val="Compact"/>
         <w:numPr>
           <w:ilvl w:val="0"/>
-          <w:numId w:val="1010"/>
+          <w:numId w:val="1009"/>
         </w:numPr>
       </w:pPr>
       <w:r>
-        <w:t xml:space="preserve">Sửa trực tiếp ô cần thay đổi</w:t>
-      </w:r>
-    </w:p>
-    <w:p>
-      <w:pPr>
-        <w:pStyle w:val="Compact"/>
-        <w:numPr>
-          <w:ilvl w:val="0"/>
-          <w:numId w:val="1010"/>
-        </w:numPr>
-      </w:pPr>
-      <w:r>
-        <w:t xml:space="preserve">Lưu là xong</w:t>
+        <w:t xml:space="preserve">Copy</w:t>
+      </w:r>
+      <w:r>
+        <w:t xml:space="preserve"> </w:t>
+      </w:r>
+      <w:r>
+        <w:rPr>
+          <w:b/>
+          <w:bCs/>
+        </w:rPr>
+        <w:t xml:space="preserve">Web app URL</w:t>
+      </w:r>
+      <w:r>
+        <w:t xml:space="preserve"> </w:t>
+      </w:r>
+      <w:r>
+        <w:t xml:space="preserve">dạng</w:t>
+      </w:r>
+      <w:r>
+        <w:t xml:space="preserve"> </w:t>
+      </w:r>
+      <w:r>
+        <w:rPr>
+          <w:rStyle w:val="VerbatimChar"/>
+        </w:rPr>
+        <w:t xml:space="preserve">https://script.google.com/macros/s/xxxxx/exec</w:t>
       </w:r>
     </w:p>
     <w:bookmarkEnd w:id="22"/>
-    <w:bookmarkStart w:id="23" w:name="lấy-link-google-maps-cho-đại-lý-mới"/>
+    <w:bookmarkStart w:id="23" w:name="bước-4-dán-url-vào-code"/>
     <w:p>
       <w:pPr>
         <w:pStyle w:val="Heading3"/>
       </w:pPr>
       <w:r>
-        <w:t xml:space="preserve">Lấy link Google Maps cho đại lý mới</w:t>
+        <w:t xml:space="preserve">Bước 4: Dán URL vào code</w:t>
+      </w:r>
+    </w:p>
+    <w:p>
+      <w:pPr>
+        <w:pStyle w:val="FirstParagraph"/>
+      </w:pPr>
+      <w:r>
+        <w:t xml:space="preserve">Mở file</w:t>
+      </w:r>
+      <w:r>
+        <w:t xml:space="preserve"> </w:t>
+      </w:r>
+      <w:r>
+        <w:rPr>
+          <w:rStyle w:val="VerbatimChar"/>
+        </w:rPr>
+        <w:t xml:space="preserve">index.html</w:t>
+      </w:r>
+      <w:r>
+        <w:t xml:space="preserve">, tìm dòng:</w:t>
+      </w:r>
+    </w:p>
+    <w:p>
+      <w:pPr>
+        <w:pStyle w:val="SourceCode"/>
+      </w:pPr>
+      <w:r>
+        <w:rPr>
+          <w:rStyle w:val="KeywordTok"/>
+        </w:rPr>
+        <w:t xml:space="preserve">const</w:t>
+      </w:r>
+      <w:r>
+        <w:rPr>
+          <w:rStyle w:val="NormalTok"/>
+        </w:rPr>
+        <w:t xml:space="preserve"> FORM_ENDPOINT </w:t>
+      </w:r>
+      <w:r>
+        <w:rPr>
+          <w:rStyle w:val="OperatorTok"/>
+        </w:rPr>
+        <w:t xml:space="preserve">=</w:t>
+      </w:r>
+      <w:r>
+        <w:rPr>
+          <w:rStyle w:val="NormalTok"/>
+        </w:rPr>
+        <w:t xml:space="preserve"> </w:t>
+      </w:r>
+      <w:r>
+        <w:rPr>
+          <w:rStyle w:val="StringTok"/>
+        </w:rPr>
+        <w:t xml:space="preserve">'PASTE_YOUR_APPS_SCRIPT_WEB_APP_URL_HERE'</w:t>
+      </w:r>
+      <w:r>
+        <w:rPr>
+          <w:rStyle w:val="OperatorTok"/>
+        </w:rPr>
+        <w:t xml:space="preserve">;</w:t>
+      </w:r>
+    </w:p>
+    <w:p>
+      <w:pPr>
+        <w:pStyle w:val="FirstParagraph"/>
+      </w:pPr>
+      <w:r>
+        <w:t xml:space="preserve">Thay bằng URL vừa copy, sau đó</w:t>
+      </w:r>
+      <w:r>
+        <w:t xml:space="preserve"> </w:t>
+      </w:r>
+      <w:r>
+        <w:rPr>
+          <w:rStyle w:val="VerbatimChar"/>
+        </w:rPr>
+        <w:t xml:space="preserve">git add</w:t>
+      </w:r>
+      <w:r>
+        <w:t xml:space="preserve">,</w:t>
+      </w:r>
+      <w:r>
+        <w:t xml:space="preserve"> </w:t>
+      </w:r>
+      <w:r>
+        <w:rPr>
+          <w:rStyle w:val="VerbatimChar"/>
+        </w:rPr>
+        <w:t xml:space="preserve">git commit</w:t>
+      </w:r>
+      <w:r>
+        <w:t xml:space="preserve">,</w:t>
+      </w:r>
+      <w:r>
+        <w:t xml:space="preserve"> </w:t>
+      </w:r>
+      <w:r>
+        <w:rPr>
+          <w:rStyle w:val="VerbatimChar"/>
+        </w:rPr>
+        <w:t xml:space="preserve">git push</w:t>
+      </w:r>
+      <w:r>
+        <w:t xml:space="preserve">.</w:t>
+      </w:r>
+    </w:p>
+    <w:p>
+      <w:pPr>
+        <w:pStyle w:val="BlockText"/>
+      </w:pPr>
+      <w:r>
+        <w:rPr>
+          <w:b/>
+          <w:bCs/>
+        </w:rPr>
+        <w:t xml:space="preserve">Lưu ý</w:t>
+      </w:r>
+      <w:r>
+        <w:t xml:space="preserve">: Mỗi khi sửa lại code trong Apps Script, phải tạo</w:t>
+      </w:r>
+      <w:r>
+        <w:t xml:space="preserve"> </w:t>
+      </w:r>
+      <w:r>
+        <w:rPr>
+          <w:b/>
+          <w:bCs/>
+        </w:rPr>
+        <w:t xml:space="preserve">New deployment</w:t>
+      </w:r>
+      <w:r>
+        <w:t xml:space="preserve"> </w:t>
+      </w:r>
+      <w:r>
+        <w:t xml:space="preserve">mới</w:t>
+      </w:r>
+      <w:r>
+        <w:t xml:space="preserve"> </w:t>
+      </w:r>
+      <w:r>
+        <w:t xml:space="preserve">(không phải Save) thì thay đổi mới có hiệu lực trên URL đang dùng.</w:t>
+      </w:r>
+    </w:p>
+    <w:p>
+      <w:r>
+        <w:pict>
+          <v:rect style="width:0;height:1.5pt" o:hralign="center" o:hrstd="t" o:hr="t"/>
+        </w:pict>
+      </w:r>
+    </w:p>
+    <w:bookmarkEnd w:id="23"/>
+    <w:bookmarkEnd w:id="24"/>
+    <w:bookmarkStart w:id="30" w:name="phần-2-team-mkt-cập-nhật-hàng-ngày"/>
+    <w:p>
+      <w:pPr>
+        <w:pStyle w:val="Heading2"/>
+      </w:pPr>
+      <w:r>
+        <w:t xml:space="preserve">PHẦN 2 — Team MKT cập nhật hàng ngày</w:t>
+      </w:r>
+    </w:p>
+    <w:bookmarkStart w:id="25" w:name="thêm-đại-lý-mới"/>
+    <w:p>
+      <w:pPr>
+        <w:pStyle w:val="Heading3"/>
+      </w:pPr>
+      <w:r>
+        <w:t xml:space="preserve">Thêm đại lý mới</w:t>
       </w:r>
     </w:p>
     <w:p>
@@ -2438,17 +2914,7 @@
         </w:numPr>
       </w:pPr>
       <w:r>
-        <w:t xml:space="preserve">Vào</w:t>
-      </w:r>
-      <w:r>
-        <w:t xml:space="preserve"> </w:t>
-      </w:r>
-      <w:r>
-        <w:rPr>
-          <w:b/>
-          <w:bCs/>
-        </w:rPr>
-        <w:t xml:space="preserve">maps.google.com</w:t>
+        <w:t xml:space="preserve">Mở Google Sheet (đã có link sẵn)</w:t>
       </w:r>
     </w:p>
     <w:p>
@@ -2460,7 +2926,7 @@
         </w:numPr>
       </w:pPr>
       <w:r>
-        <w:t xml:space="preserve">Tìm địa chỉ đại lý</w:t>
+        <w:t xml:space="preserve">Thêm 1 dòng mới với đầy đủ các cột</w:t>
       </w:r>
     </w:p>
     <w:p>
@@ -2472,72 +2938,27 @@
         </w:numPr>
       </w:pPr>
       <w:r>
-        <w:t xml:space="preserve">Bấm</w:t>
-      </w:r>
-      <w:r>
-        <w:t xml:space="preserve"> </w:t>
-      </w:r>
-      <w:r>
         <w:rPr>
           <w:b/>
           <w:bCs/>
         </w:rPr>
-        <w:t xml:space="preserve">Chia sẻ</w:t>
-      </w:r>
-      <w:r>
-        <w:t xml:space="preserve"> </w:t>
-      </w:r>
-      <w:r>
-        <w:t xml:space="preserve">→ Copy link ngắn</w:t>
-      </w:r>
-    </w:p>
-    <w:p>
-      <w:pPr>
-        <w:pStyle w:val="Compact"/>
-        <w:numPr>
-          <w:ilvl w:val="0"/>
-          <w:numId w:val="1011"/>
-        </w:numPr>
-      </w:pPr>
-      <w:r>
-        <w:t xml:space="preserve">Dán vào cột</w:t>
-      </w:r>
-      <w:r>
-        <w:t xml:space="preserve"> </w:t>
-      </w:r>
-      <w:r>
-        <w:rPr>
-          <w:rStyle w:val="VerbatimChar"/>
-        </w:rPr>
-        <w:t xml:space="preserve">maps_url</w:t>
-      </w:r>
-      <w:r>
-        <w:t xml:space="preserve"> </w:t>
-      </w:r>
-      <w:r>
-        <w:t xml:space="preserve">trong Sheet</w:t>
-      </w:r>
-    </w:p>
-    <w:bookmarkEnd w:id="23"/>
-    <w:bookmarkStart w:id="24" w:name="thêm-ảnh-trước-sau-khi-đổi-mới"/>
+        <w:t xml:space="preserve">Lưu là xong</w:t>
+      </w:r>
+      <w:r>
+        <w:t xml:space="preserve"> </w:t>
+      </w:r>
+      <w:r>
+        <w:t xml:space="preserve">— trang tự cập nhật khi người dùng load lại</w:t>
+      </w:r>
+    </w:p>
+    <w:bookmarkEnd w:id="25"/>
+    <w:bookmarkStart w:id="26" w:name="xóa-đại-lý"/>
     <w:p>
       <w:pPr>
         <w:pStyle w:val="Heading3"/>
       </w:pPr>
       <w:r>
-        <w:t xml:space="preserve">Thêm ảnh</w:t>
-      </w:r>
-      <w:r>
-        <w:t xml:space="preserve"> </w:t>
-      </w:r>
-      <w:r>
-        <w:t xml:space="preserve">“Trước &amp; Sau Khi Đổi”</w:t>
-      </w:r>
-      <w:r>
-        <w:t xml:space="preserve"> </w:t>
-      </w:r>
-      <w:r>
-        <w:t xml:space="preserve">mới</w:t>
+        <w:t xml:space="preserve">Xóa đại lý</w:t>
       </w:r>
     </w:p>
     <w:p>
@@ -2549,7 +2970,7 @@
         </w:numPr>
       </w:pPr>
       <w:r>
-        <w:t xml:space="preserve">Mở Google Sheet ảnh trước/sau (đã có link sẵn, xem Phần 1B)</w:t>
+        <w:t xml:space="preserve">Mở Google Sheet</w:t>
       </w:r>
     </w:p>
     <w:p>
@@ -2561,7 +2982,7 @@
         </w:numPr>
       </w:pPr>
       <w:r>
-        <w:t xml:space="preserve">Thêm 1 dòng mới: tên khách, mẫu giày, link ảnh trước, link ảnh sau</w:t>
+        <w:t xml:space="preserve">Xóa dòng của đại lý cần xóa</w:t>
       </w:r>
     </w:p>
     <w:p>
@@ -2573,6 +2994,209 @@
         </w:numPr>
       </w:pPr>
       <w:r>
+        <w:t xml:space="preserve">Lưu là xong</w:t>
+      </w:r>
+    </w:p>
+    <w:bookmarkEnd w:id="26"/>
+    <w:bookmarkStart w:id="27" w:name="sửa-thông-tin-đại-lý-địa-chỉ-tên"/>
+    <w:p>
+      <w:pPr>
+        <w:pStyle w:val="Heading3"/>
+      </w:pPr>
+      <w:r>
+        <w:t xml:space="preserve">Sửa thông tin đại lý (địa chỉ, tên…)</w:t>
+      </w:r>
+    </w:p>
+    <w:p>
+      <w:pPr>
+        <w:pStyle w:val="Compact"/>
+        <w:numPr>
+          <w:ilvl w:val="0"/>
+          <w:numId w:val="1013"/>
+        </w:numPr>
+      </w:pPr>
+      <w:r>
+        <w:t xml:space="preserve">Mở Google Sheet</w:t>
+      </w:r>
+    </w:p>
+    <w:p>
+      <w:pPr>
+        <w:pStyle w:val="Compact"/>
+        <w:numPr>
+          <w:ilvl w:val="0"/>
+          <w:numId w:val="1013"/>
+        </w:numPr>
+      </w:pPr>
+      <w:r>
+        <w:t xml:space="preserve">Sửa trực tiếp ô cần thay đổi</w:t>
+      </w:r>
+    </w:p>
+    <w:p>
+      <w:pPr>
+        <w:pStyle w:val="Compact"/>
+        <w:numPr>
+          <w:ilvl w:val="0"/>
+          <w:numId w:val="1013"/>
+        </w:numPr>
+      </w:pPr>
+      <w:r>
+        <w:t xml:space="preserve">Lưu là xong</w:t>
+      </w:r>
+    </w:p>
+    <w:bookmarkEnd w:id="27"/>
+    <w:bookmarkStart w:id="28" w:name="lấy-link-google-maps-cho-đại-lý-mới"/>
+    <w:p>
+      <w:pPr>
+        <w:pStyle w:val="Heading3"/>
+      </w:pPr>
+      <w:r>
+        <w:t xml:space="preserve">Lấy link Google Maps cho đại lý mới</w:t>
+      </w:r>
+    </w:p>
+    <w:p>
+      <w:pPr>
+        <w:pStyle w:val="Compact"/>
+        <w:numPr>
+          <w:ilvl w:val="0"/>
+          <w:numId w:val="1014"/>
+        </w:numPr>
+      </w:pPr>
+      <w:r>
+        <w:t xml:space="preserve">Vào</w:t>
+      </w:r>
+      <w:r>
+        <w:t xml:space="preserve"> </w:t>
+      </w:r>
+      <w:r>
+        <w:rPr>
+          <w:b/>
+          <w:bCs/>
+        </w:rPr>
+        <w:t xml:space="preserve">maps.google.com</w:t>
+      </w:r>
+    </w:p>
+    <w:p>
+      <w:pPr>
+        <w:pStyle w:val="Compact"/>
+        <w:numPr>
+          <w:ilvl w:val="0"/>
+          <w:numId w:val="1014"/>
+        </w:numPr>
+      </w:pPr>
+      <w:r>
+        <w:t xml:space="preserve">Tìm địa chỉ đại lý</w:t>
+      </w:r>
+    </w:p>
+    <w:p>
+      <w:pPr>
+        <w:pStyle w:val="Compact"/>
+        <w:numPr>
+          <w:ilvl w:val="0"/>
+          <w:numId w:val="1014"/>
+        </w:numPr>
+      </w:pPr>
+      <w:r>
+        <w:t xml:space="preserve">Bấm</w:t>
+      </w:r>
+      <w:r>
+        <w:t xml:space="preserve"> </w:t>
+      </w:r>
+      <w:r>
+        <w:rPr>
+          <w:b/>
+          <w:bCs/>
+        </w:rPr>
+        <w:t xml:space="preserve">Chia sẻ</w:t>
+      </w:r>
+      <w:r>
+        <w:t xml:space="preserve"> </w:t>
+      </w:r>
+      <w:r>
+        <w:t xml:space="preserve">→ Copy link ngắn</w:t>
+      </w:r>
+    </w:p>
+    <w:p>
+      <w:pPr>
+        <w:pStyle w:val="Compact"/>
+        <w:numPr>
+          <w:ilvl w:val="0"/>
+          <w:numId w:val="1014"/>
+        </w:numPr>
+      </w:pPr>
+      <w:r>
+        <w:t xml:space="preserve">Dán vào cột</w:t>
+      </w:r>
+      <w:r>
+        <w:t xml:space="preserve"> </w:t>
+      </w:r>
+      <w:r>
+        <w:rPr>
+          <w:rStyle w:val="VerbatimChar"/>
+        </w:rPr>
+        <w:t xml:space="preserve">maps_url</w:t>
+      </w:r>
+      <w:r>
+        <w:t xml:space="preserve"> </w:t>
+      </w:r>
+      <w:r>
+        <w:t xml:space="preserve">trong Sheet</w:t>
+      </w:r>
+    </w:p>
+    <w:bookmarkEnd w:id="28"/>
+    <w:bookmarkStart w:id="29" w:name="thêm-ảnh-trước-sau-khi-đổi-mới"/>
+    <w:p>
+      <w:pPr>
+        <w:pStyle w:val="Heading3"/>
+      </w:pPr>
+      <w:r>
+        <w:t xml:space="preserve">Thêm ảnh</w:t>
+      </w:r>
+      <w:r>
+        <w:t xml:space="preserve"> </w:t>
+      </w:r>
+      <w:r>
+        <w:t xml:space="preserve">“Trước &amp; Sau Khi Đổi”</w:t>
+      </w:r>
+      <w:r>
+        <w:t xml:space="preserve"> </w:t>
+      </w:r>
+      <w:r>
+        <w:t xml:space="preserve">mới</w:t>
+      </w:r>
+    </w:p>
+    <w:p>
+      <w:pPr>
+        <w:pStyle w:val="Compact"/>
+        <w:numPr>
+          <w:ilvl w:val="0"/>
+          <w:numId w:val="1015"/>
+        </w:numPr>
+      </w:pPr>
+      <w:r>
+        <w:t xml:space="preserve">Mở Google Sheet ảnh trước/sau (đã có link sẵn, xem Phần 1B)</w:t>
+      </w:r>
+    </w:p>
+    <w:p>
+      <w:pPr>
+        <w:pStyle w:val="Compact"/>
+        <w:numPr>
+          <w:ilvl w:val="0"/>
+          <w:numId w:val="1015"/>
+        </w:numPr>
+      </w:pPr>
+      <w:r>
+        <w:t xml:space="preserve">Thêm 1 dòng mới: tên khách, mẫu giày, link ảnh trước, link ảnh sau</w:t>
+      </w:r>
+    </w:p>
+    <w:p>
+      <w:pPr>
+        <w:pStyle w:val="Compact"/>
+        <w:numPr>
+          <w:ilvl w:val="0"/>
+          <w:numId w:val="1015"/>
+        </w:numPr>
+      </w:pPr>
+      <w:r>
         <w:rPr>
           <w:b/>
           <w:bCs/>
@@ -2593,9 +3217,9 @@
         </w:pict>
       </w:r>
     </w:p>
-    <w:bookmarkEnd w:id="24"/>
-    <w:bookmarkEnd w:id="25"/>
-    <w:bookmarkStart w:id="26" w:name="phần-3-thay-đổi-cần-dev-push-lên-github"/>
+    <w:bookmarkEnd w:id="29"/>
+    <w:bookmarkEnd w:id="30"/>
+    <w:bookmarkStart w:id="31" w:name="phần-3-thay-đổi-cần-dev-push-lên-github"/>
     <w:p>
       <w:pPr>
         <w:pStyle w:val="Heading2"/>
@@ -2792,8 +3416,8 @@
         </w:pict>
       </w:r>
     </w:p>
-    <w:bookmarkEnd w:id="26"/>
-    <w:bookmarkStart w:id="27" w:name="liên-hệ-hỗ-trợ"/>
+    <w:bookmarkEnd w:id="31"/>
+    <w:bookmarkStart w:id="32" w:name="liên-hệ-hỗ-trợ"/>
     <w:p>
       <w:pPr>
         <w:pStyle w:val="Heading2"/>
@@ -2807,7 +3431,7 @@
         <w:pStyle w:val="Compact"/>
         <w:numPr>
           <w:ilvl w:val="0"/>
-          <w:numId w:val="1013"/>
+          <w:numId w:val="1016"/>
         </w:numPr>
       </w:pPr>
       <w:r>
@@ -2826,7 +3450,7 @@
         <w:pStyle w:val="Compact"/>
         <w:numPr>
           <w:ilvl w:val="0"/>
-          <w:numId w:val="1013"/>
+          <w:numId w:val="1016"/>
         </w:numPr>
       </w:pPr>
       <w:r>
@@ -2840,8 +3464,8 @@
         <w:t xml:space="preserve">: contact@nero.com.vn</w:t>
       </w:r>
     </w:p>
-    <w:bookmarkEnd w:id="27"/>
-    <w:bookmarkEnd w:id="28"/>
+    <w:bookmarkEnd w:id="32"/>
+    <w:bookmarkEnd w:id="33"/>
     <w:sectPr>
       <w:footnotePr>
         <w:numRestart w:val="eachSect"/>
@@ -3445,34 +4069,7 @@
     </w:lvlOverride>
   </w:num>
   <w:num w:numId="1010">
-    <w:abstractNumId w:val="99411"/>
-    <w:lvlOverride w:ilvl="0">
-      <w:startOverride w:val="1"/>
-    </w:lvlOverride>
-    <w:lvlOverride w:ilvl="1">
-      <w:startOverride w:val="1"/>
-    </w:lvlOverride>
-    <w:lvlOverride w:ilvl="2">
-      <w:startOverride w:val="1"/>
-    </w:lvlOverride>
-    <w:lvlOverride w:ilvl="3">
-      <w:startOverride w:val="1"/>
-    </w:lvlOverride>
-    <w:lvlOverride w:ilvl="4">
-      <w:startOverride w:val="1"/>
-    </w:lvlOverride>
-    <w:lvlOverride w:ilvl="5">
-      <w:startOverride w:val="1"/>
-    </w:lvlOverride>
-    <w:lvlOverride w:ilvl="6">
-      <w:startOverride w:val="1"/>
-    </w:lvlOverride>
-    <w:lvlOverride w:ilvl="7">
-      <w:startOverride w:val="1"/>
-    </w:lvlOverride>
-    <w:lvlOverride w:ilvl="8">
-      <w:startOverride w:val="1"/>
-    </w:lvlOverride>
+    <w:abstractNumId w:val="991"/>
   </w:num>
   <w:num w:numId="1011">
     <w:abstractNumId w:val="99411"/>
@@ -3535,6 +4132,96 @@
     </w:lvlOverride>
   </w:num>
   <w:num w:numId="1013">
+    <w:abstractNumId w:val="99411"/>
+    <w:lvlOverride w:ilvl="0">
+      <w:startOverride w:val="1"/>
+    </w:lvlOverride>
+    <w:lvlOverride w:ilvl="1">
+      <w:startOverride w:val="1"/>
+    </w:lvlOverride>
+    <w:lvlOverride w:ilvl="2">
+      <w:startOverride w:val="1"/>
+    </w:lvlOverride>
+    <w:lvlOverride w:ilvl="3">
+      <w:startOverride w:val="1"/>
+    </w:lvlOverride>
+    <w:lvlOverride w:ilvl="4">
+      <w:startOverride w:val="1"/>
+    </w:lvlOverride>
+    <w:lvlOverride w:ilvl="5">
+      <w:startOverride w:val="1"/>
+    </w:lvlOverride>
+    <w:lvlOverride w:ilvl="6">
+      <w:startOverride w:val="1"/>
+    </w:lvlOverride>
+    <w:lvlOverride w:ilvl="7">
+      <w:startOverride w:val="1"/>
+    </w:lvlOverride>
+    <w:lvlOverride w:ilvl="8">
+      <w:startOverride w:val="1"/>
+    </w:lvlOverride>
+  </w:num>
+  <w:num w:numId="1014">
+    <w:abstractNumId w:val="99411"/>
+    <w:lvlOverride w:ilvl="0">
+      <w:startOverride w:val="1"/>
+    </w:lvlOverride>
+    <w:lvlOverride w:ilvl="1">
+      <w:startOverride w:val="1"/>
+    </w:lvlOverride>
+    <w:lvlOverride w:ilvl="2">
+      <w:startOverride w:val="1"/>
+    </w:lvlOverride>
+    <w:lvlOverride w:ilvl="3">
+      <w:startOverride w:val="1"/>
+    </w:lvlOverride>
+    <w:lvlOverride w:ilvl="4">
+      <w:startOverride w:val="1"/>
+    </w:lvlOverride>
+    <w:lvlOverride w:ilvl="5">
+      <w:startOverride w:val="1"/>
+    </w:lvlOverride>
+    <w:lvlOverride w:ilvl="6">
+      <w:startOverride w:val="1"/>
+    </w:lvlOverride>
+    <w:lvlOverride w:ilvl="7">
+      <w:startOverride w:val="1"/>
+    </w:lvlOverride>
+    <w:lvlOverride w:ilvl="8">
+      <w:startOverride w:val="1"/>
+    </w:lvlOverride>
+  </w:num>
+  <w:num w:numId="1015">
+    <w:abstractNumId w:val="99411"/>
+    <w:lvlOverride w:ilvl="0">
+      <w:startOverride w:val="1"/>
+    </w:lvlOverride>
+    <w:lvlOverride w:ilvl="1">
+      <w:startOverride w:val="1"/>
+    </w:lvlOverride>
+    <w:lvlOverride w:ilvl="2">
+      <w:startOverride w:val="1"/>
+    </w:lvlOverride>
+    <w:lvlOverride w:ilvl="3">
+      <w:startOverride w:val="1"/>
+    </w:lvlOverride>
+    <w:lvlOverride w:ilvl="4">
+      <w:startOverride w:val="1"/>
+    </w:lvlOverride>
+    <w:lvlOverride w:ilvl="5">
+      <w:startOverride w:val="1"/>
+    </w:lvlOverride>
+    <w:lvlOverride w:ilvl="6">
+      <w:startOverride w:val="1"/>
+    </w:lvlOverride>
+    <w:lvlOverride w:ilvl="7">
+      <w:startOverride w:val="1"/>
+    </w:lvlOverride>
+    <w:lvlOverride w:ilvl="8">
+      <w:startOverride w:val="1"/>
+    </w:lvlOverride>
+  </w:num>
+  <w:num w:numId="1016">
     <w:abstractNumId w:val="991"/>
   </w:num>
 </w:numbering>

</xml_diff>